<commit_message>
Add all entities to tables.
</commit_message>
<xml_diff>
--- a/Documents/RaceDay_ERD.docx
+++ b/Documents/RaceDay_ERD.docx
@@ -3,6 +3,893 @@
 <w:document xmlns:wpc="http://schemas.microsoft.com/office/word/2010/wordprocessingCanvas" xmlns:cx="http://schemas.microsoft.com/office/drawing/2014/chartex" xmlns:cx1="http://schemas.microsoft.com/office/drawing/2015/9/8/chartex" xmlns:cx2="http://schemas.microsoft.com/office/drawing/2015/10/21/chartex" xmlns:cx3="http://schemas.microsoft.com/office/drawing/2016/5/9/chartex" xmlns:cx4="http://schemas.microsoft.com/office/drawing/2016/5/10/chartex" xmlns:cx5="http://schemas.microsoft.com/office/drawing/2016/5/11/chartex" xmlns:cx6="http://schemas.microsoft.com/office/drawing/2016/5/12/chartex" xmlns:cx7="http://schemas.microsoft.com/office/drawing/2016/5/13/chartex" xmlns:cx8="http://schemas.microsoft.com/office/drawing/2016/5/14/chartex" xmlns:mc="http://schemas.openxmlformats.org/markup-compatibility/2006" xmlns:aink="http://schemas.microsoft.com/office/drawing/2016/ink" xmlns:am3d="http://schemas.microsoft.com/office/drawing/2017/model3d" xmlns:o="urn:schemas-microsoft-com:office:office" xmlns:oel="http://schemas.microsoft.com/office/2019/extlst" xmlns:r="http://schemas.openxmlformats.org/officeDocument/2006/relationships" xmlns:m="http://schemas.openxmlformats.org/officeDocument/2006/math" xmlns:v="urn:schemas-microsoft-com:vml" xmlns:wp14="http://schemas.microsoft.com/office/word/2010/wordprocessingDrawing" xmlns:wp="http://schemas.openxmlformats.org/drawingml/2006/wordprocessingDrawing" xmlns:w10="urn:schemas-microsoft-com:office:word" xmlns:w="http://schemas.openxmlformats.org/wordprocessingml/2006/main" xmlns:w14="http://schemas.microsoft.com/office/word/2010/wordml" xmlns:w15="http://schemas.microsoft.com/office/word/2012/wordml" xmlns:w16cei="http://schemas.microsoft.com/office/word/2026/wordml/cei" xmlns:w16cex="http://schemas.microsoft.com/office/word/2018/wordml/cex" xmlns:w16cid="http://schemas.microsoft.com/office/word/2016/wordml/cid" xmlns:w16="http://schemas.microsoft.com/office/word/2018/wordml" xmlns:w16du="http://schemas.microsoft.com/office/word/2023/wordml/word16du" xmlns:w16sdtdh="http://schemas.microsoft.com/office/word/2020/wordml/sdtdatahash" xmlns:w16sdtfl="http://schemas.microsoft.com/office/word/2024/wordml/sdtformatlock" xmlns:w16se="http://schemas.microsoft.com/office/word/2015/wordml/symex" xmlns:wpg="http://schemas.microsoft.com/office/word/2010/wordprocessingGroup" xmlns:wpi="http://schemas.microsoft.com/office/word/2010/wordprocessingInk" xmlns:wne="http://schemas.microsoft.com/office/word/2006/wordml" xmlns:wps="http://schemas.microsoft.com/office/word/2010/wordprocessingShape" mc:Ignorable="w14 w15 w16se w16cid w16 w16cex w16sdtdh w16sdtfl w16du wp14">
   <w:body>
     <w:p>
+      <w:r>
+        <w:rPr>
+          <w:noProof/>
+        </w:rPr>
+        <mc:AlternateContent>
+          <mc:Choice Requires="wpg">
+            <w:drawing>
+              <wp:anchor distT="0" distB="0" distL="114300" distR="114300" simplePos="0" relativeHeight="251683840" behindDoc="0" locked="0" layoutInCell="1" allowOverlap="1" wp14:anchorId="12D1D56A" wp14:editId="793D577D">
+                <wp:simplePos x="0" y="0"/>
+                <wp:positionH relativeFrom="column">
+                  <wp:posOffset>-581025</wp:posOffset>
+                </wp:positionH>
+                <wp:positionV relativeFrom="paragraph">
+                  <wp:posOffset>2343150</wp:posOffset>
+                </wp:positionV>
+                <wp:extent cx="1785620" cy="2412986"/>
+                <wp:effectExtent l="0" t="0" r="24130" b="26035"/>
+                <wp:wrapNone/>
+                <wp:docPr id="470000935" name="Group 9"/>
+                <wp:cNvGraphicFramePr/>
+                <a:graphic xmlns:a="http://schemas.openxmlformats.org/drawingml/2006/main">
+                  <a:graphicData uri="http://schemas.microsoft.com/office/word/2010/wordprocessingGroup">
+                    <wpg:wgp>
+                      <wpg:cNvGrpSpPr/>
+                      <wpg:grpSpPr>
+                        <a:xfrm>
+                          <a:off x="0" y="0"/>
+                          <a:ext cx="1785620" cy="2412986"/>
+                          <a:chOff x="0" y="0"/>
+                          <a:chExt cx="1785620" cy="2412986"/>
+                        </a:xfrm>
+                      </wpg:grpSpPr>
+                      <wpg:grpSp>
+                        <wpg:cNvPr id="889718258" name="Group 6"/>
+                        <wpg:cNvGrpSpPr/>
+                        <wpg:grpSpPr>
+                          <a:xfrm>
+                            <a:off x="0" y="0"/>
+                            <a:ext cx="1785620" cy="2412986"/>
+                            <a:chOff x="0" y="0"/>
+                            <a:chExt cx="1785620" cy="2412986"/>
+                          </a:xfrm>
+                        </wpg:grpSpPr>
+                        <wps:wsp>
+                          <wps:cNvPr id="2142979933" name="Rectangle 1"/>
+                          <wps:cNvSpPr/>
+                          <wps:spPr>
+                            <a:xfrm>
+                              <a:off x="0" y="0"/>
+                              <a:ext cx="1785620" cy="2412986"/>
+                            </a:xfrm>
+                            <a:prstGeom prst="rect">
+                              <a:avLst/>
+                            </a:prstGeom>
+                            <a:noFill/>
+                            <a:ln>
+                              <a:solidFill>
+                                <a:schemeClr val="tx1"/>
+                              </a:solidFill>
+                            </a:ln>
+                          </wps:spPr>
+                          <wps:style>
+                            <a:lnRef idx="2">
+                              <a:schemeClr val="accent1">
+                                <a:shade val="15000"/>
+                              </a:schemeClr>
+                            </a:lnRef>
+                            <a:fillRef idx="1">
+                              <a:schemeClr val="accent1"/>
+                            </a:fillRef>
+                            <a:effectRef idx="0">
+                              <a:schemeClr val="accent1"/>
+                            </a:effectRef>
+                            <a:fontRef idx="minor">
+                              <a:schemeClr val="lt1"/>
+                            </a:fontRef>
+                          </wps:style>
+                          <wps:bodyPr rot="0" spcFirstLastPara="0" vertOverflow="overflow" horzOverflow="overflow" vert="horz" wrap="square" lIns="91440" tIns="45720" rIns="91440" bIns="45720" numCol="1" spcCol="0" rtlCol="0" fromWordArt="0" anchor="ctr" anchorCtr="0" forceAA="0" compatLnSpc="1">
+                            <a:prstTxWarp prst="textNoShape">
+                              <a:avLst/>
+                            </a:prstTxWarp>
+                            <a:noAutofit/>
+                          </wps:bodyPr>
+                        </wps:wsp>
+                        <wps:wsp>
+                          <wps:cNvPr id="156428323" name="Straight Connector 5"/>
+                          <wps:cNvCnPr/>
+                          <wps:spPr>
+                            <a:xfrm>
+                              <a:off x="0" y="393405"/>
+                              <a:ext cx="1785620" cy="0"/>
+                            </a:xfrm>
+                            <a:prstGeom prst="line">
+                              <a:avLst/>
+                            </a:prstGeom>
+                          </wps:spPr>
+                          <wps:style>
+                            <a:lnRef idx="1">
+                              <a:schemeClr val="dk1"/>
+                            </a:lnRef>
+                            <a:fillRef idx="0">
+                              <a:schemeClr val="dk1"/>
+                            </a:fillRef>
+                            <a:effectRef idx="0">
+                              <a:schemeClr val="dk1"/>
+                            </a:effectRef>
+                            <a:fontRef idx="minor">
+                              <a:schemeClr val="tx1"/>
+                            </a:fontRef>
+                          </wps:style>
+                          <wps:bodyPr/>
+                        </wps:wsp>
+                      </wpg:grpSp>
+                      <wps:wsp>
+                        <wps:cNvPr id="943448402" name="Text Box 8"/>
+                        <wps:cNvSpPr txBox="1"/>
+                        <wps:spPr>
+                          <a:xfrm>
+                            <a:off x="171450" y="0"/>
+                            <a:ext cx="1531089" cy="329508"/>
+                          </a:xfrm>
+                          <a:prstGeom prst="rect">
+                            <a:avLst/>
+                          </a:prstGeom>
+                          <a:noFill/>
+                          <a:ln w="6350">
+                            <a:noFill/>
+                          </a:ln>
+                        </wps:spPr>
+                        <wps:txbx>
+                          <w:txbxContent>
+                            <w:p>
+                              <w:pPr>
+                                <w:jc w:val="center"/>
+                              </w:pPr>
+                              <w:r>
+                                <w:t>CATERGORY</w:t>
+                              </w:r>
+                            </w:p>
+                          </w:txbxContent>
+                        </wps:txbx>
+                        <wps:bodyPr rot="0" spcFirstLastPara="0" vertOverflow="overflow" horzOverflow="overflow" vert="horz" wrap="square" lIns="91440" tIns="45720" rIns="91440" bIns="45720" numCol="1" spcCol="0" rtlCol="0" fromWordArt="0" anchor="t" anchorCtr="0" forceAA="0" compatLnSpc="1">
+                          <a:prstTxWarp prst="textNoShape">
+                            <a:avLst/>
+                          </a:prstTxWarp>
+                          <a:noAutofit/>
+                        </wps:bodyPr>
+                      </wps:wsp>
+                      <wps:wsp>
+                        <wps:cNvPr id="1956241869" name="Text Box 7"/>
+                        <wps:cNvSpPr txBox="1"/>
+                        <wps:spPr>
+                          <a:xfrm>
+                            <a:off x="0" y="438150"/>
+                            <a:ext cx="1722400" cy="1850065"/>
+                          </a:xfrm>
+                          <a:prstGeom prst="rect">
+                            <a:avLst/>
+                          </a:prstGeom>
+                          <a:noFill/>
+                          <a:ln w="6350">
+                            <a:noFill/>
+                          </a:ln>
+                        </wps:spPr>
+                        <wps:txbx>
+                          <w:txbxContent>
+                            <w:p>
+                              <w:pPr>
+                                <w:spacing w:after="0"/>
+                              </w:pPr>
+                              <w:r>
+                                <w:t>CatergoryID (PK)</w:t>
+                              </w:r>
+                            </w:p>
+                            <w:p>
+                              <w:pPr>
+                                <w:spacing w:after="0"/>
+                              </w:pPr>
+                              <w:r>
+                                <w:t>Age</w:t>
+                              </w:r>
+                            </w:p>
+                            <w:p>
+                              <w:pPr>
+                                <w:spacing w:after="0"/>
+                              </w:pPr>
+                              <w:r>
+                                <w:t>EventID (</w:t>
+                              </w:r>
+                              <w:r>
+                                <w:t>F</w:t>
+                              </w:r>
+                              <w:r>
+                                <w:t>K)</w:t>
+                              </w:r>
+                            </w:p>
+                            <w:p>
+                              <w:pPr>
+                                <w:spacing w:after="0"/>
+                              </w:pPr>
+                            </w:p>
+                          </w:txbxContent>
+                        </wps:txbx>
+                        <wps:bodyPr rot="0" spcFirstLastPara="0" vertOverflow="overflow" horzOverflow="overflow" vert="horz" wrap="square" lIns="91440" tIns="45720" rIns="91440" bIns="45720" numCol="1" spcCol="0" rtlCol="0" fromWordArt="0" anchor="t" anchorCtr="0" forceAA="0" compatLnSpc="1">
+                          <a:prstTxWarp prst="textNoShape">
+                            <a:avLst/>
+                          </a:prstTxWarp>
+                          <a:noAutofit/>
+                        </wps:bodyPr>
+                      </wps:wsp>
+                    </wpg:wgp>
+                  </a:graphicData>
+                </a:graphic>
+              </wp:anchor>
+            </w:drawing>
+          </mc:Choice>
+          <mc:Fallback>
+            <w:pict>
+              <v:group w14:anchorId="12D1D56A" id="Group 9" o:spid="_x0000_s1026" style="position:absolute;margin-left:-45.75pt;margin-top:184.5pt;width:140.6pt;height:190pt;z-index:251683840" coordsize="17856,24129" o:gfxdata="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">
+                <v:group id="Group 6" o:spid="_x0000_s1027" style="position:absolute;width:17856;height:24129" coordsize="17856,24129" o:gfxdata="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">
+                  <v:rect id="Rectangle 1" o:spid="_x0000_s1028" style="position:absolute;width:17856;height:24129;visibility:visible;mso-wrap-style:square;v-text-anchor:middle" o:gfxdata="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" filled="f" strokecolor="black [3213]" strokeweight="1pt"/>
+                  <v:line id="Straight Connector 5" o:spid="_x0000_s1029" style="position:absolute;visibility:visible;mso-wrap-style:square" from="0,3934" to="17856,3934" o:connectortype="straight" o:gfxdata="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" strokecolor="black [3200]" strokeweight=".5pt">
+                    <v:stroke joinstyle="miter"/>
+                  </v:line>
+                </v:group>
+                <v:shapetype id="_x0000_t202" coordsize="21600,21600" o:spt="202" path="m,l,21600r21600,l21600,xe">
+                  <v:stroke joinstyle="miter"/>
+                  <v:path gradientshapeok="t" o:connecttype="rect"/>
+                </v:shapetype>
+                <v:shape id="_x0000_s1030" type="#_x0000_t202" style="position:absolute;left:1714;width:15311;height:3295;visibility:visible;mso-wrap-style:square;v-text-anchor:top" o:gfxdata="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" filled="f" stroked="f" strokeweight=".5pt">
+                  <v:textbox>
+                    <w:txbxContent>
+                      <w:p>
+                        <w:pPr>
+                          <w:jc w:val="center"/>
+                        </w:pPr>
+                        <w:r>
+                          <w:t>CATERGORY</w:t>
+                        </w:r>
+                      </w:p>
+                    </w:txbxContent>
+                  </v:textbox>
+                </v:shape>
+                <v:shape id="_x0000_s1031" type="#_x0000_t202" style="position:absolute;top:4381;width:17224;height:18501;visibility:visible;mso-wrap-style:square;v-text-anchor:top" o:gfxdata="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" filled="f" stroked="f" strokeweight=".5pt">
+                  <v:textbox>
+                    <w:txbxContent>
+                      <w:p>
+                        <w:pPr>
+                          <w:spacing w:after="0"/>
+                        </w:pPr>
+                        <w:r>
+                          <w:t>CatergoryID (PK)</w:t>
+                        </w:r>
+                      </w:p>
+                      <w:p>
+                        <w:pPr>
+                          <w:spacing w:after="0"/>
+                        </w:pPr>
+                        <w:r>
+                          <w:t>Age</w:t>
+                        </w:r>
+                      </w:p>
+                      <w:p>
+                        <w:pPr>
+                          <w:spacing w:after="0"/>
+                        </w:pPr>
+                        <w:r>
+                          <w:t>EventID (</w:t>
+                        </w:r>
+                        <w:r>
+                          <w:t>F</w:t>
+                        </w:r>
+                        <w:r>
+                          <w:t>K)</w:t>
+                        </w:r>
+                      </w:p>
+                      <w:p>
+                        <w:pPr>
+                          <w:spacing w:after="0"/>
+                        </w:pPr>
+                      </w:p>
+                    </w:txbxContent>
+                  </v:textbox>
+                </v:shape>
+              </v:group>
+            </w:pict>
+          </mc:Fallback>
+        </mc:AlternateContent>
+      </w:r>
+      <w:r>
+        <w:rPr>
+          <w:noProof/>
+        </w:rPr>
+        <mc:AlternateContent>
+          <mc:Choice Requires="wpg">
+            <w:drawing>
+              <wp:anchor distT="0" distB="0" distL="114300" distR="114300" simplePos="0" relativeHeight="251691008" behindDoc="0" locked="0" layoutInCell="1" allowOverlap="1" wp14:anchorId="7D7ABC92" wp14:editId="1224BE5A">
+                <wp:simplePos x="0" y="0"/>
+                <wp:positionH relativeFrom="column">
+                  <wp:posOffset>2143125</wp:posOffset>
+                </wp:positionH>
+                <wp:positionV relativeFrom="paragraph">
+                  <wp:posOffset>2343150</wp:posOffset>
+                </wp:positionV>
+                <wp:extent cx="1785620" cy="2412986"/>
+                <wp:effectExtent l="0" t="0" r="24130" b="26035"/>
+                <wp:wrapNone/>
+                <wp:docPr id="2146181152" name="Group 10"/>
+                <wp:cNvGraphicFramePr/>
+                <a:graphic xmlns:a="http://schemas.openxmlformats.org/drawingml/2006/main">
+                  <a:graphicData uri="http://schemas.microsoft.com/office/word/2010/wordprocessingGroup">
+                    <wpg:wgp>
+                      <wpg:cNvGrpSpPr/>
+                      <wpg:grpSpPr>
+                        <a:xfrm>
+                          <a:off x="0" y="0"/>
+                          <a:ext cx="1785620" cy="2412986"/>
+                          <a:chOff x="0" y="0"/>
+                          <a:chExt cx="1785620" cy="2412986"/>
+                        </a:xfrm>
+                      </wpg:grpSpPr>
+                      <wpg:grpSp>
+                        <wpg:cNvPr id="52866290" name="Group 6"/>
+                        <wpg:cNvGrpSpPr/>
+                        <wpg:grpSpPr>
+                          <a:xfrm>
+                            <a:off x="0" y="0"/>
+                            <a:ext cx="1785620" cy="2412986"/>
+                            <a:chOff x="0" y="0"/>
+                            <a:chExt cx="1785620" cy="2412986"/>
+                          </a:xfrm>
+                        </wpg:grpSpPr>
+                        <wps:wsp>
+                          <wps:cNvPr id="1283416338" name="Rectangle 1"/>
+                          <wps:cNvSpPr/>
+                          <wps:spPr>
+                            <a:xfrm>
+                              <a:off x="0" y="0"/>
+                              <a:ext cx="1785620" cy="2412986"/>
+                            </a:xfrm>
+                            <a:prstGeom prst="rect">
+                              <a:avLst/>
+                            </a:prstGeom>
+                            <a:noFill/>
+                            <a:ln>
+                              <a:solidFill>
+                                <a:schemeClr val="tx1"/>
+                              </a:solidFill>
+                            </a:ln>
+                          </wps:spPr>
+                          <wps:style>
+                            <a:lnRef idx="2">
+                              <a:schemeClr val="accent1">
+                                <a:shade val="15000"/>
+                              </a:schemeClr>
+                            </a:lnRef>
+                            <a:fillRef idx="1">
+                              <a:schemeClr val="accent1"/>
+                            </a:fillRef>
+                            <a:effectRef idx="0">
+                              <a:schemeClr val="accent1"/>
+                            </a:effectRef>
+                            <a:fontRef idx="minor">
+                              <a:schemeClr val="lt1"/>
+                            </a:fontRef>
+                          </wps:style>
+                          <wps:bodyPr rot="0" spcFirstLastPara="0" vertOverflow="overflow" horzOverflow="overflow" vert="horz" wrap="square" lIns="91440" tIns="45720" rIns="91440" bIns="45720" numCol="1" spcCol="0" rtlCol="0" fromWordArt="0" anchor="ctr" anchorCtr="0" forceAA="0" compatLnSpc="1">
+                            <a:prstTxWarp prst="textNoShape">
+                              <a:avLst/>
+                            </a:prstTxWarp>
+                            <a:noAutofit/>
+                          </wps:bodyPr>
+                        </wps:wsp>
+                        <wps:wsp>
+                          <wps:cNvPr id="696352583" name="Straight Connector 5"/>
+                          <wps:cNvCnPr/>
+                          <wps:spPr>
+                            <a:xfrm>
+                              <a:off x="0" y="393405"/>
+                              <a:ext cx="1785620" cy="0"/>
+                            </a:xfrm>
+                            <a:prstGeom prst="line">
+                              <a:avLst/>
+                            </a:prstGeom>
+                          </wps:spPr>
+                          <wps:style>
+                            <a:lnRef idx="1">
+                              <a:schemeClr val="dk1"/>
+                            </a:lnRef>
+                            <a:fillRef idx="0">
+                              <a:schemeClr val="dk1"/>
+                            </a:fillRef>
+                            <a:effectRef idx="0">
+                              <a:schemeClr val="dk1"/>
+                            </a:effectRef>
+                            <a:fontRef idx="minor">
+                              <a:schemeClr val="tx1"/>
+                            </a:fontRef>
+                          </wps:style>
+                          <wps:bodyPr/>
+                        </wps:wsp>
+                      </wpg:grpSp>
+                      <wps:wsp>
+                        <wps:cNvPr id="180389286" name="Text Box 8"/>
+                        <wps:cNvSpPr txBox="1"/>
+                        <wps:spPr>
+                          <a:xfrm>
+                            <a:off x="133350" y="0"/>
+                            <a:ext cx="1531089" cy="329508"/>
+                          </a:xfrm>
+                          <a:prstGeom prst="rect">
+                            <a:avLst/>
+                          </a:prstGeom>
+                          <a:noFill/>
+                          <a:ln w="6350">
+                            <a:noFill/>
+                          </a:ln>
+                        </wps:spPr>
+                        <wps:txbx>
+                          <w:txbxContent>
+                            <w:p>
+                              <w:pPr>
+                                <w:jc w:val="center"/>
+                              </w:pPr>
+                              <w:r>
+                                <w:t>ENROLLMENT</w:t>
+                              </w:r>
+                            </w:p>
+                          </w:txbxContent>
+                        </wps:txbx>
+                        <wps:bodyPr rot="0" spcFirstLastPara="0" vertOverflow="overflow" horzOverflow="overflow" vert="horz" wrap="square" lIns="91440" tIns="45720" rIns="91440" bIns="45720" numCol="1" spcCol="0" rtlCol="0" fromWordArt="0" anchor="t" anchorCtr="0" forceAA="0" compatLnSpc="1">
+                          <a:prstTxWarp prst="textNoShape">
+                            <a:avLst/>
+                          </a:prstTxWarp>
+                          <a:noAutofit/>
+                        </wps:bodyPr>
+                      </wps:wsp>
+                      <wps:wsp>
+                        <wps:cNvPr id="152246080" name="Text Box 7"/>
+                        <wps:cNvSpPr txBox="1"/>
+                        <wps:spPr>
+                          <a:xfrm>
+                            <a:off x="28575" y="447675"/>
+                            <a:ext cx="1722400" cy="1850065"/>
+                          </a:xfrm>
+                          <a:prstGeom prst="rect">
+                            <a:avLst/>
+                          </a:prstGeom>
+                          <a:noFill/>
+                          <a:ln w="6350">
+                            <a:noFill/>
+                          </a:ln>
+                        </wps:spPr>
+                        <wps:txbx>
+                          <w:txbxContent>
+                            <w:p>
+                              <w:pPr>
+                                <w:spacing w:after="0"/>
+                              </w:pPr>
+                              <w:r>
+                                <w:t>Enrollment</w:t>
+                              </w:r>
+                              <w:r>
+                                <w:t>ID (PK)</w:t>
+                              </w:r>
+                            </w:p>
+                            <w:p>
+                              <w:r>
+                                <w:t>ParticipantID (</w:t>
+                              </w:r>
+                              <w:r>
+                                <w:t>F</w:t>
+                              </w:r>
+                              <w:r>
+                                <w:t>K)</w:t>
+                              </w:r>
+                            </w:p>
+                            <w:p>
+                              <w:r>
+                                <w:t>EventID (FK)</w:t>
+                              </w:r>
+                            </w:p>
+                            <w:p>
+                              <w:pPr>
+                                <w:spacing w:after="0"/>
+                              </w:pPr>
+                            </w:p>
+                          </w:txbxContent>
+                        </wps:txbx>
+                        <wps:bodyPr rot="0" spcFirstLastPara="0" vertOverflow="overflow" horzOverflow="overflow" vert="horz" wrap="square" lIns="91440" tIns="45720" rIns="91440" bIns="45720" numCol="1" spcCol="0" rtlCol="0" fromWordArt="0" anchor="t" anchorCtr="0" forceAA="0" compatLnSpc="1">
+                          <a:prstTxWarp prst="textNoShape">
+                            <a:avLst/>
+                          </a:prstTxWarp>
+                          <a:noAutofit/>
+                        </wps:bodyPr>
+                      </wps:wsp>
+                    </wpg:wgp>
+                  </a:graphicData>
+                </a:graphic>
+              </wp:anchor>
+            </w:drawing>
+          </mc:Choice>
+          <mc:Fallback>
+            <w:pict>
+              <v:group w14:anchorId="7D7ABC92" id="Group 10" o:spid="_x0000_s1032" style="position:absolute;margin-left:168.75pt;margin-top:184.5pt;width:140.6pt;height:190pt;z-index:251691008" coordsize="17856,24129" o:gfxdata="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">
+                <v:group id="Group 6" o:spid="_x0000_s1033" style="position:absolute;width:17856;height:24129" coordsize="17856,24129" o:gfxdata="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">
+                  <v:rect id="Rectangle 1" o:spid="_x0000_s1034" style="position:absolute;width:17856;height:24129;visibility:visible;mso-wrap-style:square;v-text-anchor:middle" o:gfxdata="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" filled="f" strokecolor="black [3213]" strokeweight="1pt"/>
+                  <v:line id="Straight Connector 5" o:spid="_x0000_s1035" style="position:absolute;visibility:visible;mso-wrap-style:square" from="0,3934" to="17856,3934" o:connectortype="straight" o:gfxdata="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" strokecolor="black [3200]" strokeweight=".5pt">
+                    <v:stroke joinstyle="miter"/>
+                  </v:line>
+                </v:group>
+                <v:shape id="_x0000_s1036" type="#_x0000_t202" style="position:absolute;left:1333;width:15311;height:3295;visibility:visible;mso-wrap-style:square;v-text-anchor:top" o:gfxdata="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" filled="f" stroked="f" strokeweight=".5pt">
+                  <v:textbox>
+                    <w:txbxContent>
+                      <w:p>
+                        <w:pPr>
+                          <w:jc w:val="center"/>
+                        </w:pPr>
+                        <w:r>
+                          <w:t>ENROLLMENT</w:t>
+                        </w:r>
+                      </w:p>
+                    </w:txbxContent>
+                  </v:textbox>
+                </v:shape>
+                <v:shape id="_x0000_s1037" type="#_x0000_t202" style="position:absolute;left:285;top:4476;width:17224;height:18501;visibility:visible;mso-wrap-style:square;v-text-anchor:top" o:gfxdata="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" filled="f" stroked="f" strokeweight=".5pt">
+                  <v:textbox>
+                    <w:txbxContent>
+                      <w:p>
+                        <w:pPr>
+                          <w:spacing w:after="0"/>
+                        </w:pPr>
+                        <w:r>
+                          <w:t>Enrollment</w:t>
+                        </w:r>
+                        <w:r>
+                          <w:t>ID (PK)</w:t>
+                        </w:r>
+                      </w:p>
+                      <w:p>
+                        <w:r>
+                          <w:t>ParticipantID (</w:t>
+                        </w:r>
+                        <w:r>
+                          <w:t>F</w:t>
+                        </w:r>
+                        <w:r>
+                          <w:t>K)</w:t>
+                        </w:r>
+                      </w:p>
+                      <w:p>
+                        <w:r>
+                          <w:t>EventID (FK)</w:t>
+                        </w:r>
+                      </w:p>
+                      <w:p>
+                        <w:pPr>
+                          <w:spacing w:after="0"/>
+                        </w:pPr>
+                      </w:p>
+                    </w:txbxContent>
+                  </v:textbox>
+                </v:shape>
+              </v:group>
+            </w:pict>
+          </mc:Fallback>
+        </mc:AlternateContent>
+      </w:r>
+      <w:r>
+        <w:rPr>
+          <w:noProof/>
+        </w:rPr>
+        <mc:AlternateContent>
+          <mc:Choice Requires="wpg">
+            <w:drawing>
+              <wp:anchor distT="0" distB="0" distL="114300" distR="114300" simplePos="0" relativeHeight="251698176" behindDoc="0" locked="0" layoutInCell="1" allowOverlap="1" wp14:anchorId="3DF4F6DC" wp14:editId="31AFA783">
+                <wp:simplePos x="0" y="0"/>
+                <wp:positionH relativeFrom="column">
+                  <wp:posOffset>4800600</wp:posOffset>
+                </wp:positionH>
+                <wp:positionV relativeFrom="paragraph">
+                  <wp:posOffset>2343150</wp:posOffset>
+                </wp:positionV>
+                <wp:extent cx="1785620" cy="2412986"/>
+                <wp:effectExtent l="0" t="0" r="24130" b="26035"/>
+                <wp:wrapNone/>
+                <wp:docPr id="622609608" name="Group 11"/>
+                <wp:cNvGraphicFramePr/>
+                <a:graphic xmlns:a="http://schemas.openxmlformats.org/drawingml/2006/main">
+                  <a:graphicData uri="http://schemas.microsoft.com/office/word/2010/wordprocessingGroup">
+                    <wpg:wgp>
+                      <wpg:cNvGrpSpPr/>
+                      <wpg:grpSpPr>
+                        <a:xfrm>
+                          <a:off x="0" y="0"/>
+                          <a:ext cx="1785620" cy="2412986"/>
+                          <a:chOff x="0" y="0"/>
+                          <a:chExt cx="1785620" cy="2412986"/>
+                        </a:xfrm>
+                      </wpg:grpSpPr>
+                      <wpg:grpSp>
+                        <wpg:cNvPr id="161341096" name="Group 6"/>
+                        <wpg:cNvGrpSpPr/>
+                        <wpg:grpSpPr>
+                          <a:xfrm>
+                            <a:off x="0" y="0"/>
+                            <a:ext cx="1785620" cy="2412986"/>
+                            <a:chOff x="0" y="0"/>
+                            <a:chExt cx="1785620" cy="2412986"/>
+                          </a:xfrm>
+                        </wpg:grpSpPr>
+                        <wps:wsp>
+                          <wps:cNvPr id="1896871516" name="Rectangle 1"/>
+                          <wps:cNvSpPr/>
+                          <wps:spPr>
+                            <a:xfrm>
+                              <a:off x="0" y="0"/>
+                              <a:ext cx="1785620" cy="2412986"/>
+                            </a:xfrm>
+                            <a:prstGeom prst="rect">
+                              <a:avLst/>
+                            </a:prstGeom>
+                            <a:noFill/>
+                            <a:ln>
+                              <a:solidFill>
+                                <a:schemeClr val="tx1"/>
+                              </a:solidFill>
+                            </a:ln>
+                          </wps:spPr>
+                          <wps:style>
+                            <a:lnRef idx="2">
+                              <a:schemeClr val="accent1">
+                                <a:shade val="15000"/>
+                              </a:schemeClr>
+                            </a:lnRef>
+                            <a:fillRef idx="1">
+                              <a:schemeClr val="accent1"/>
+                            </a:fillRef>
+                            <a:effectRef idx="0">
+                              <a:schemeClr val="accent1"/>
+                            </a:effectRef>
+                            <a:fontRef idx="minor">
+                              <a:schemeClr val="lt1"/>
+                            </a:fontRef>
+                          </wps:style>
+                          <wps:bodyPr rot="0" spcFirstLastPara="0" vertOverflow="overflow" horzOverflow="overflow" vert="horz" wrap="square" lIns="91440" tIns="45720" rIns="91440" bIns="45720" numCol="1" spcCol="0" rtlCol="0" fromWordArt="0" anchor="ctr" anchorCtr="0" forceAA="0" compatLnSpc="1">
+                            <a:prstTxWarp prst="textNoShape">
+                              <a:avLst/>
+                            </a:prstTxWarp>
+                            <a:noAutofit/>
+                          </wps:bodyPr>
+                        </wps:wsp>
+                        <wps:wsp>
+                          <wps:cNvPr id="2040589087" name="Straight Connector 5"/>
+                          <wps:cNvCnPr/>
+                          <wps:spPr>
+                            <a:xfrm>
+                              <a:off x="0" y="393405"/>
+                              <a:ext cx="1785620" cy="0"/>
+                            </a:xfrm>
+                            <a:prstGeom prst="line">
+                              <a:avLst/>
+                            </a:prstGeom>
+                          </wps:spPr>
+                          <wps:style>
+                            <a:lnRef idx="1">
+                              <a:schemeClr val="dk1"/>
+                            </a:lnRef>
+                            <a:fillRef idx="0">
+                              <a:schemeClr val="dk1"/>
+                            </a:fillRef>
+                            <a:effectRef idx="0">
+                              <a:schemeClr val="dk1"/>
+                            </a:effectRef>
+                            <a:fontRef idx="minor">
+                              <a:schemeClr val="tx1"/>
+                            </a:fontRef>
+                          </wps:style>
+                          <wps:bodyPr/>
+                        </wps:wsp>
+                      </wpg:grpSp>
+                      <wps:wsp>
+                        <wps:cNvPr id="168984613" name="Text Box 8"/>
+                        <wps:cNvSpPr txBox="1"/>
+                        <wps:spPr>
+                          <a:xfrm>
+                            <a:off x="76200" y="0"/>
+                            <a:ext cx="1531089" cy="329508"/>
+                          </a:xfrm>
+                          <a:prstGeom prst="rect">
+                            <a:avLst/>
+                          </a:prstGeom>
+                          <a:noFill/>
+                          <a:ln w="6350">
+                            <a:noFill/>
+                          </a:ln>
+                        </wps:spPr>
+                        <wps:txbx>
+                          <w:txbxContent>
+                            <w:p>
+                              <w:pPr>
+                                <w:jc w:val="center"/>
+                              </w:pPr>
+                              <w:r>
+                                <w:t>RESULTS</w:t>
+                              </w:r>
+                            </w:p>
+                          </w:txbxContent>
+                        </wps:txbx>
+                        <wps:bodyPr rot="0" spcFirstLastPara="0" vertOverflow="overflow" horzOverflow="overflow" vert="horz" wrap="square" lIns="91440" tIns="45720" rIns="91440" bIns="45720" numCol="1" spcCol="0" rtlCol="0" fromWordArt="0" anchor="t" anchorCtr="0" forceAA="0" compatLnSpc="1">
+                          <a:prstTxWarp prst="textNoShape">
+                            <a:avLst/>
+                          </a:prstTxWarp>
+                          <a:noAutofit/>
+                        </wps:bodyPr>
+                      </wps:wsp>
+                      <wps:wsp>
+                        <wps:cNvPr id="722368163" name="Text Box 7"/>
+                        <wps:cNvSpPr txBox="1"/>
+                        <wps:spPr>
+                          <a:xfrm>
+                            <a:off x="0" y="447675"/>
+                            <a:ext cx="1722400" cy="1850065"/>
+                          </a:xfrm>
+                          <a:prstGeom prst="rect">
+                            <a:avLst/>
+                          </a:prstGeom>
+                          <a:noFill/>
+                          <a:ln w="6350">
+                            <a:noFill/>
+                          </a:ln>
+                        </wps:spPr>
+                        <wps:txbx>
+                          <w:txbxContent>
+                            <w:p>
+                              <w:pPr>
+                                <w:spacing w:after="0"/>
+                              </w:pPr>
+                              <w:r>
+                                <w:t>Resul</w:t>
+                              </w:r>
+                              <w:r>
+                                <w:t>tID (PK)</w:t>
+                              </w:r>
+                            </w:p>
+                            <w:p>
+                              <w:pPr>
+                                <w:spacing w:after="0"/>
+                              </w:pPr>
+                              <w:r>
+                                <w:t>FinishTime</w:t>
+                              </w:r>
+                            </w:p>
+                            <w:p>
+                              <w:pPr>
+                                <w:spacing w:after="0"/>
+                              </w:pPr>
+                              <w:r>
+                                <w:t>FinishPosition</w:t>
+                              </w:r>
+                            </w:p>
+                            <w:p>
+                              <w:r>
+                                <w:t>ParticipantID (FK)</w:t>
+                              </w:r>
+                            </w:p>
+                            <w:p>
+                              <w:r>
+                                <w:t>EventID (FK)</w:t>
+                              </w:r>
+                            </w:p>
+                            <w:p>
+                              <w:pPr>
+                                <w:spacing w:after="0"/>
+                              </w:pPr>
+                              <w:r>
+                                <w:t>CatergoryID (PK)</w:t>
+                              </w:r>
+                            </w:p>
+                            <w:p/>
+                            <w:p/>
+                            <w:p>
+                              <w:pPr>
+                                <w:spacing w:after="0"/>
+                              </w:pPr>
+                            </w:p>
+                          </w:txbxContent>
+                        </wps:txbx>
+                        <wps:bodyPr rot="0" spcFirstLastPara="0" vertOverflow="overflow" horzOverflow="overflow" vert="horz" wrap="square" lIns="91440" tIns="45720" rIns="91440" bIns="45720" numCol="1" spcCol="0" rtlCol="0" fromWordArt="0" anchor="t" anchorCtr="0" forceAA="0" compatLnSpc="1">
+                          <a:prstTxWarp prst="textNoShape">
+                            <a:avLst/>
+                          </a:prstTxWarp>
+                          <a:noAutofit/>
+                        </wps:bodyPr>
+                      </wps:wsp>
+                    </wpg:wgp>
+                  </a:graphicData>
+                </a:graphic>
+              </wp:anchor>
+            </w:drawing>
+          </mc:Choice>
+          <mc:Fallback>
+            <w:pict>
+              <v:group w14:anchorId="3DF4F6DC" id="Group 11" o:spid="_x0000_s1038" style="position:absolute;margin-left:378pt;margin-top:184.5pt;width:140.6pt;height:190pt;z-index:251698176" coordsize="17856,24129" o:gfxdata="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">
+                <v:group id="Group 6" o:spid="_x0000_s1039" style="position:absolute;width:17856;height:24129" coordsize="17856,24129" o:gfxdata="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">
+                  <v:rect id="Rectangle 1" o:spid="_x0000_s1040" style="position:absolute;width:17856;height:24129;visibility:visible;mso-wrap-style:square;v-text-anchor:middle" o:gfxdata="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" filled="f" strokecolor="black [3213]" strokeweight="1pt"/>
+                  <v:line id="Straight Connector 5" o:spid="_x0000_s1041" style="position:absolute;visibility:visible;mso-wrap-style:square" from="0,3934" to="17856,3934" o:connectortype="straight" o:gfxdata="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" strokecolor="black [3200]" strokeweight=".5pt">
+                    <v:stroke joinstyle="miter"/>
+                  </v:line>
+                </v:group>
+                <v:shape id="_x0000_s1042" type="#_x0000_t202" style="position:absolute;left:762;width:15310;height:3295;visibility:visible;mso-wrap-style:square;v-text-anchor:top" o:gfxdata="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" filled="f" stroked="f" strokeweight=".5pt">
+                  <v:textbox>
+                    <w:txbxContent>
+                      <w:p>
+                        <w:pPr>
+                          <w:jc w:val="center"/>
+                        </w:pPr>
+                        <w:r>
+                          <w:t>RESULTS</w:t>
+                        </w:r>
+                      </w:p>
+                    </w:txbxContent>
+                  </v:textbox>
+                </v:shape>
+                <v:shape id="_x0000_s1043" type="#_x0000_t202" style="position:absolute;top:4476;width:17224;height:18501;visibility:visible;mso-wrap-style:square;v-text-anchor:top" o:gfxdata="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" filled="f" stroked="f" strokeweight=".5pt">
+                  <v:textbox>
+                    <w:txbxContent>
+                      <w:p>
+                        <w:pPr>
+                          <w:spacing w:after="0"/>
+                        </w:pPr>
+                        <w:r>
+                          <w:t>Resul</w:t>
+                        </w:r>
+                        <w:r>
+                          <w:t>tID (PK)</w:t>
+                        </w:r>
+                      </w:p>
+                      <w:p>
+                        <w:pPr>
+                          <w:spacing w:after="0"/>
+                        </w:pPr>
+                        <w:r>
+                          <w:t>FinishTime</w:t>
+                        </w:r>
+                      </w:p>
+                      <w:p>
+                        <w:pPr>
+                          <w:spacing w:after="0"/>
+                        </w:pPr>
+                        <w:r>
+                          <w:t>FinishPosition</w:t>
+                        </w:r>
+                      </w:p>
+                      <w:p>
+                        <w:r>
+                          <w:t>ParticipantID (FK)</w:t>
+                        </w:r>
+                      </w:p>
+                      <w:p>
+                        <w:r>
+                          <w:t>EventID (FK)</w:t>
+                        </w:r>
+                      </w:p>
+                      <w:p>
+                        <w:pPr>
+                          <w:spacing w:after="0"/>
+                        </w:pPr>
+                        <w:r>
+                          <w:t>CatergoryID (PK)</w:t>
+                        </w:r>
+                      </w:p>
+                      <w:p/>
+                      <w:p/>
+                      <w:p>
+                        <w:pPr>
+                          <w:spacing w:after="0"/>
+                        </w:pPr>
+                      </w:p>
+                    </w:txbxContent>
+                  </v:textbox>
+                </v:shape>
+              </v:group>
+            </w:pict>
+          </mc:Fallback>
+        </mc:AlternateContent>
+      </w:r>
       <w:r>
         <w:rPr>
           <w:noProof/>
@@ -130,11 +1017,7 @@
           </mc:Choice>
           <mc:Fallback>
             <w:pict>
-              <v:shapetype w14:anchorId="01A719A1" id="_x0000_t202" coordsize="21600,21600" o:spt="202" path="m,l,21600r21600,l21600,xe">
-                <v:stroke joinstyle="miter"/>
-                <v:path gradientshapeok="t" o:connecttype="rect"/>
-              </v:shapetype>
-              <v:shape id="Text Box 7" o:spid="_x0000_s1026" type="#_x0000_t202" style="position:absolute;margin-left:555.25pt;margin-top:-7.25pt;width:135.6pt;height:145.65pt;z-index:251676672;visibility:visible;mso-wrap-style:square;mso-width-percent:0;mso-wrap-distance-left:9pt;mso-wrap-distance-top:0;mso-wrap-distance-right:9pt;mso-wrap-distance-bottom:0;mso-position-horizontal:absolute;mso-position-horizontal-relative:text;mso-position-vertical:absolute;mso-position-vertical-relative:text;mso-width-percent:0;mso-width-relative:margin;v-text-anchor:top" o:gfxdata="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" filled="f" stroked="f" strokeweight=".5pt">
+              <v:shape w14:anchorId="01A719A1" id="Text Box 7" o:spid="_x0000_s1044" type="#_x0000_t202" style="position:absolute;margin-left:555.25pt;margin-top:-7.25pt;width:135.6pt;height:145.65pt;z-index:251676672;visibility:visible;mso-wrap-style:square;mso-width-percent:0;mso-wrap-distance-left:9pt;mso-wrap-distance-top:0;mso-wrap-distance-right:9pt;mso-wrap-distance-bottom:0;mso-position-horizontal:absolute;mso-position-horizontal-relative:text;mso-position-vertical:absolute;mso-position-vertical-relative:text;mso-width-percent:0;mso-width-relative:margin;v-text-anchor:top" o:gfxdata="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" filled="f" stroked="f" strokeweight=".5pt">
                 <v:textbox>
                   <w:txbxContent>
                     <w:p>
@@ -279,7 +1162,7 @@
           </mc:Choice>
           <mc:Fallback>
             <w:pict>
-              <v:shape w14:anchorId="57E44D0C" id="Text Box 8" o:spid="_x0000_s1027" type="#_x0000_t202" style="position:absolute;margin-left:558.65pt;margin-top:-41.55pt;width:120.55pt;height:25.95pt;z-index:251674624;visibility:visible;mso-wrap-style:square;mso-height-percent:0;mso-wrap-distance-left:9pt;mso-wrap-distance-top:0;mso-wrap-distance-right:9pt;mso-wrap-distance-bottom:0;mso-position-horizontal:absolute;mso-position-horizontal-relative:text;mso-position-vertical:absolute;mso-position-vertical-relative:text;mso-height-percent:0;mso-height-relative:margin;v-text-anchor:top" o:gfxdata="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" filled="f" stroked="f" strokeweight=".5pt">
+              <v:shape w14:anchorId="57E44D0C" id="Text Box 8" o:spid="_x0000_s1045" type="#_x0000_t202" style="position:absolute;margin-left:558.65pt;margin-top:-41.55pt;width:120.55pt;height:25.95pt;z-index:251674624;visibility:visible;mso-wrap-style:square;mso-height-percent:0;mso-wrap-distance-left:9pt;mso-wrap-distance-top:0;mso-wrap-distance-right:9pt;mso-wrap-distance-bottom:0;mso-position-horizontal:absolute;mso-position-horizontal-relative:text;mso-position-vertical:absolute;mso-position-vertical-relative:text;mso-height-percent:0;mso-height-relative:margin;v-text-anchor:top" o:gfxdata="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" filled="f" stroked="f" strokeweight=".5pt">
                 <v:textbox>
                   <w:txbxContent>
                     <w:p>
@@ -406,7 +1289,7 @@
           </mc:Choice>
           <mc:Fallback>
             <w:pict>
-              <v:group w14:anchorId="0D031A55" id="Group 6" o:spid="_x0000_s1026" style="position:absolute;margin-left:551.15pt;margin-top:-45.7pt;width:140.6pt;height:190pt;z-index:251672576" coordsize="17856,24129" o:gfxdata="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">
+              <v:group w14:anchorId="1D1EE431" id="Group 6" o:spid="_x0000_s1026" style="position:absolute;margin-left:551.15pt;margin-top:-45.7pt;width:140.6pt;height:190pt;z-index:251672576" coordsize="17856,24129" o:gfxdata="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">
                 <v:rect id="Rectangle 1" o:spid="_x0000_s1027" style="position:absolute;width:17856;height:24129;visibility:visible;mso-wrap-style:square;v-text-anchor:middle" o:gfxdata="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" filled="f" strokecolor="black [3213]" strokeweight="1pt"/>
                 <v:line id="Straight Connector 5" o:spid="_x0000_s1028" style="position:absolute;visibility:visible;mso-wrap-style:square" from="0,3934" to="17856,3934" o:connectortype="straight" o:gfxdata="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" strokecolor="black [3200]" strokeweight=".5pt">
                   <v:stroke joinstyle="miter"/>
@@ -504,7 +1387,7 @@
           </mc:Choice>
           <mc:Fallback>
             <w:pict>
-              <v:shape w14:anchorId="78B0191B" id="_x0000_s1028" type="#_x0000_t202" style="position:absolute;margin-left:380.3pt;margin-top:-7.25pt;width:135.6pt;height:145.65pt;z-index:251670528;visibility:visible;mso-wrap-style:square;mso-width-percent:0;mso-wrap-distance-left:9pt;mso-wrap-distance-top:0;mso-wrap-distance-right:9pt;mso-wrap-distance-bottom:0;mso-position-horizontal:absolute;mso-position-horizontal-relative:text;mso-position-vertical:absolute;mso-position-vertical-relative:text;mso-width-percent:0;mso-width-relative:margin;v-text-anchor:top" o:gfxdata="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" filled="f" stroked="f" strokeweight=".5pt">
+              <v:shape w14:anchorId="78B0191B" id="_x0000_s1046" type="#_x0000_t202" style="position:absolute;margin-left:380.3pt;margin-top:-7.25pt;width:135.6pt;height:145.65pt;z-index:251670528;visibility:visible;mso-wrap-style:square;mso-width-percent:0;mso-wrap-distance-left:9pt;mso-wrap-distance-top:0;mso-wrap-distance-right:9pt;mso-wrap-distance-bottom:0;mso-position-horizontal:absolute;mso-position-horizontal-relative:text;mso-position-vertical:absolute;mso-position-vertical-relative:text;mso-width-percent:0;mso-width-relative:margin;v-text-anchor:top" o:gfxdata="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" filled="f" stroked="f" strokeweight=".5pt">
                 <v:textbox>
                   <w:txbxContent>
                     <w:p>
@@ -610,7 +1493,7 @@
           </mc:Choice>
           <mc:Fallback>
             <w:pict>
-              <v:shape w14:anchorId="4AE8FACF" id="_x0000_s1029" type="#_x0000_t202" style="position:absolute;margin-left:387.9pt;margin-top:-45.75pt;width:120.55pt;height:25.95pt;z-index:251668480;visibility:visible;mso-wrap-style:square;mso-height-percent:0;mso-wrap-distance-left:9pt;mso-wrap-distance-top:0;mso-wrap-distance-right:9pt;mso-wrap-distance-bottom:0;mso-position-horizontal:absolute;mso-position-horizontal-relative:text;mso-position-vertical:absolute;mso-position-vertical-relative:text;mso-height-percent:0;mso-height-relative:margin;v-text-anchor:top" o:gfxdata="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" filled="f" stroked="f" strokeweight=".5pt">
+              <v:shape w14:anchorId="4AE8FACF" id="_x0000_s1047" type="#_x0000_t202" style="position:absolute;margin-left:387.9pt;margin-top:-45.75pt;width:120.55pt;height:25.95pt;z-index:251668480;visibility:visible;mso-wrap-style:square;mso-height-percent:0;mso-wrap-distance-left:9pt;mso-wrap-distance-top:0;mso-wrap-distance-right:9pt;mso-wrap-distance-bottom:0;mso-position-horizontal:absolute;mso-position-horizontal-relative:text;mso-position-vertical:absolute;mso-position-vertical-relative:text;mso-height-percent:0;mso-height-relative:margin;v-text-anchor:top" o:gfxdata="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" filled="f" stroked="f" strokeweight=".5pt">
                 <v:textbox>
                   <w:txbxContent>
                     <w:p>
@@ -737,7 +1620,7 @@
           </mc:Choice>
           <mc:Fallback>
             <w:pict>
-              <v:group w14:anchorId="33961BA0" id="Group 6" o:spid="_x0000_s1026" style="position:absolute;margin-left:377.8pt;margin-top:-45.7pt;width:140.6pt;height:190pt;z-index:251666432" coordsize="17856,24129" o:gfxdata="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">
+              <v:group w14:anchorId="1B9BEC3E" id="Group 6" o:spid="_x0000_s1026" style="position:absolute;margin-left:377.8pt;margin-top:-45.7pt;width:140.6pt;height:190pt;z-index:251666432" coordsize="17856,24129" o:gfxdata="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">
                 <v:rect id="Rectangle 1" o:spid="_x0000_s1027" style="position:absolute;width:17856;height:24129;visibility:visible;mso-wrap-style:square;v-text-anchor:middle" o:gfxdata="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" filled="f" strokecolor="black [3213]" strokeweight="1pt"/>
                 <v:line id="Straight Connector 5" o:spid="_x0000_s1028" style="position:absolute;visibility:visible;mso-wrap-style:square" from="0,3934" to="17856,3934" o:connectortype="straight" o:gfxdata="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" strokecolor="black [3200]" strokeweight=".5pt">
                   <v:stroke joinstyle="miter"/>
@@ -813,7 +1696,7 @@
           </mc:Choice>
           <mc:Fallback>
             <w:pict>
-              <v:shape w14:anchorId="42260455" id="_x0000_s1030" type="#_x0000_t202" style="position:absolute;margin-left:179.15pt;margin-top:-41pt;width:120.55pt;height:25.95pt;z-index:251664384;visibility:visible;mso-wrap-style:square;mso-height-percent:0;mso-wrap-distance-left:9pt;mso-wrap-distance-top:0;mso-wrap-distance-right:9pt;mso-wrap-distance-bottom:0;mso-position-horizontal:absolute;mso-position-horizontal-relative:text;mso-position-vertical:absolute;mso-position-vertical-relative:text;mso-height-percent:0;mso-height-relative:margin;v-text-anchor:top" o:gfxdata="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" filled="f" stroked="f" strokeweight=".5pt">
+              <v:shape w14:anchorId="42260455" id="_x0000_s1048" type="#_x0000_t202" style="position:absolute;margin-left:179.15pt;margin-top:-41pt;width:120.55pt;height:25.95pt;z-index:251664384;visibility:visible;mso-wrap-style:square;mso-height-percent:0;mso-wrap-distance-left:9pt;mso-wrap-distance-top:0;mso-wrap-distance-right:9pt;mso-wrap-distance-bottom:0;mso-position-horizontal:absolute;mso-position-horizontal-relative:text;mso-position-vertical:absolute;mso-position-vertical-relative:text;mso-height-percent:0;mso-height-relative:margin;v-text-anchor:top" o:gfxdata="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" filled="f" stroked="f" strokeweight=".5pt">
                 <v:textbox>
                   <w:txbxContent>
                     <w:p>
@@ -920,7 +1803,7 @@
           </mc:Choice>
           <mc:Fallback>
             <w:pict>
-              <v:shape w14:anchorId="5D435B23" id="_x0000_s1031" type="#_x0000_t202" style="position:absolute;margin-left:170.75pt;margin-top:-6.6pt;width:135.6pt;height:145.65pt;z-index:251663360;visibility:visible;mso-wrap-style:square;mso-width-percent:0;mso-wrap-distance-left:9pt;mso-wrap-distance-top:0;mso-wrap-distance-right:9pt;mso-wrap-distance-bottom:0;mso-position-horizontal:absolute;mso-position-horizontal-relative:text;mso-position-vertical:absolute;mso-position-vertical-relative:text;mso-width-percent:0;mso-width-relative:margin;v-text-anchor:top" o:gfxdata="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" filled="f" stroked="f" strokeweight=".5pt">
+              <v:shape w14:anchorId="5D435B23" id="_x0000_s1049" type="#_x0000_t202" style="position:absolute;margin-left:170.75pt;margin-top:-6.6pt;width:135.6pt;height:145.65pt;z-index:251663360;visibility:visible;mso-wrap-style:square;mso-width-percent:0;mso-wrap-distance-left:9pt;mso-wrap-distance-top:0;mso-wrap-distance-right:9pt;mso-wrap-distance-bottom:0;mso-position-horizontal:absolute;mso-position-horizontal-relative:text;mso-position-vertical:absolute;mso-position-vertical-relative:text;mso-width-percent:0;mso-width-relative:margin;v-text-anchor:top" o:gfxdata="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" filled="f" stroked="f" strokeweight=".5pt">
                 <v:textbox>
                   <w:txbxContent>
                     <w:p>
@@ -1070,7 +1953,7 @@
           </mc:Choice>
           <mc:Fallback>
             <w:pict>
-              <v:group w14:anchorId="2EB630D6" id="Group 6" o:spid="_x0000_s1026" style="position:absolute;margin-left:170.8pt;margin-top:-46.05pt;width:140.6pt;height:190pt;z-index:251662336" coordsize="17856,24129" o:gfxdata="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">
+              <v:group w14:anchorId="16BBCD7B" id="Group 6" o:spid="_x0000_s1026" style="position:absolute;margin-left:170.8pt;margin-top:-46.05pt;width:140.6pt;height:190pt;z-index:251662336" coordsize="17856,24129" o:gfxdata="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">
                 <v:rect id="Rectangle 1" o:spid="_x0000_s1027" style="position:absolute;width:17856;height:24129;visibility:visible;mso-wrap-style:square;v-text-anchor:middle" o:gfxdata="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" filled="f" strokecolor="black [3213]" strokeweight="1pt"/>
                 <v:line id="Straight Connector 5" o:spid="_x0000_s1028" style="position:absolute;visibility:visible;mso-wrap-style:square" from="0,3934" to="17856,3934" o:connectortype="straight" o:gfxdata="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" strokecolor="black [3200]" strokeweight=".5pt">
                   <v:stroke joinstyle="miter"/>
@@ -1155,7 +2038,7 @@
           </mc:Choice>
           <mc:Fallback>
             <w:pict>
-              <v:rect w14:anchorId="0F6BB8A7" id="Rectangle 1" o:spid="_x0000_s1026" style="position:absolute;margin-left:-46.9pt;margin-top:-46.05pt;width:140.6pt;height:190pt;z-index:251655168;visibility:visible;mso-wrap-style:square;mso-width-percent:0;mso-height-percent:0;mso-wrap-distance-left:9pt;mso-wrap-distance-top:0;mso-wrap-distance-right:9pt;mso-wrap-distance-bottom:0;mso-position-horizontal:absolute;mso-position-horizontal-relative:text;mso-position-vertical:absolute;mso-position-vertical-relative:text;mso-width-percent:0;mso-height-percent:0;mso-width-relative:margin;mso-height-relative:margin;v-text-anchor:middle" o:gfxdata="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" filled="f" strokecolor="black [3213]" strokeweight="1pt"/>
+              <v:rect w14:anchorId="2EF9E7A7" id="Rectangle 1" o:spid="_x0000_s1026" style="position:absolute;margin-left:-46.9pt;margin-top:-46.05pt;width:140.6pt;height:190pt;z-index:251655168;visibility:visible;mso-wrap-style:square;mso-width-percent:0;mso-height-percent:0;mso-wrap-distance-left:9pt;mso-wrap-distance-top:0;mso-wrap-distance-right:9pt;mso-wrap-distance-bottom:0;mso-position-horizontal:absolute;mso-position-horizontal-relative:text;mso-position-vertical:absolute;mso-position-vertical-relative:text;mso-width-percent:0;mso-height-percent:0;mso-width-relative:margin;mso-height-relative:margin;v-text-anchor:middle" o:gfxdata="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" filled="f" strokecolor="black [3213]" strokeweight="1pt"/>
             </w:pict>
           </mc:Fallback>
         </mc:AlternateContent>
@@ -1252,7 +2135,7 @@
           </mc:Choice>
           <mc:Fallback>
             <w:pict>
-              <v:shape w14:anchorId="6601BB60" id="Text Box 3" o:spid="_x0000_s1032" type="#_x0000_t202" style="position:absolute;margin-left:-42.7pt;margin-top:-6.7pt;width:136.45pt;height:150.7pt;z-index:251657216;visibility:visible;mso-wrap-style:square;mso-width-percent:0;mso-height-percent:0;mso-wrap-distance-left:9pt;mso-wrap-distance-top:0;mso-wrap-distance-right:9pt;mso-wrap-distance-bottom:0;mso-position-horizontal:absolute;mso-position-horizontal-relative:text;mso-position-vertical:absolute;mso-position-vertical-relative:text;mso-width-percent:0;mso-height-percent:0;mso-width-relative:margin;mso-height-relative:margin;v-text-anchor:top" o:gfxdata="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" filled="f" stroked="f" strokeweight=".5pt">
+              <v:shape w14:anchorId="6601BB60" id="Text Box 3" o:spid="_x0000_s1050" type="#_x0000_t202" style="position:absolute;margin-left:-42.7pt;margin-top:-6.7pt;width:136.45pt;height:150.7pt;z-index:251657216;visibility:visible;mso-wrap-style:square;mso-width-percent:0;mso-height-percent:0;mso-wrap-distance-left:9pt;mso-wrap-distance-top:0;mso-wrap-distance-right:9pt;mso-wrap-distance-bottom:0;mso-position-horizontal:absolute;mso-position-horizontal-relative:text;mso-position-vertical:absolute;mso-position-vertical-relative:text;mso-width-percent:0;mso-height-percent:0;mso-width-relative:margin;mso-height-relative:margin;v-text-anchor:top" o:gfxdata="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" filled="f" stroked="f" strokeweight=".5pt">
                 <v:textbox>
                   <w:txbxContent>
                     <w:p>
@@ -1359,7 +2242,7 @@
           </mc:Choice>
           <mc:Fallback>
             <w:pict>
-              <v:shape w14:anchorId="4AA8398A" id="Text Box 4" o:spid="_x0000_s1033" type="#_x0000_t202" style="position:absolute;margin-left:-42.7pt;margin-top:-39.35pt;width:130.6pt;height:24.25pt;z-index:251658240;visibility:visible;mso-wrap-style:square;mso-width-percent:0;mso-wrap-distance-left:9pt;mso-wrap-distance-top:0;mso-wrap-distance-right:9pt;mso-wrap-distance-bottom:0;mso-position-horizontal:absolute;mso-position-horizontal-relative:text;mso-position-vertical:absolute;mso-position-vertical-relative:text;mso-width-percent:0;mso-width-relative:margin;v-text-anchor:top" o:gfxdata="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" filled="f" stroked="f" strokeweight=".5pt">
+              <v:shape w14:anchorId="4AA8398A" id="Text Box 4" o:spid="_x0000_s1051" type="#_x0000_t202" style="position:absolute;margin-left:-42.7pt;margin-top:-39.35pt;width:130.6pt;height:24.25pt;z-index:251658240;visibility:visible;mso-wrap-style:square;mso-width-percent:0;mso-wrap-distance-left:9pt;mso-wrap-distance-top:0;mso-wrap-distance-right:9pt;mso-wrap-distance-bottom:0;mso-position-horizontal:absolute;mso-position-horizontal-relative:text;mso-position-vertical:absolute;mso-position-vertical-relative:text;mso-width-percent:0;mso-width-relative:margin;v-text-anchor:top" o:gfxdata="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" filled="f" stroked="f" strokeweight=".5pt">
                 <v:textbox>
                   <w:txbxContent>
                     <w:p>
@@ -1439,7 +2322,7 @@
           </mc:Choice>
           <mc:Fallback>
             <w:pict>
-              <v:line w14:anchorId="7C7F59AE" id="Straight Connector 2" o:spid="_x0000_s1026" style="position:absolute;z-index:251656192;visibility:visible;mso-wrap-style:square;mso-width-percent:0;mso-height-percent:0;mso-wrap-distance-left:9pt;mso-wrap-distance-top:0;mso-wrap-distance-right:9pt;mso-wrap-distance-bottom:0;mso-position-horizontal:absolute;mso-position-horizontal-relative:text;mso-position-vertical:absolute;mso-position-vertical-relative:text;mso-width-percent:0;mso-height-percent:0;mso-width-relative:margin;mso-height-relative:margin" from="-46.9pt,-10.9pt" to="93.75pt,-10.9pt" o:gfxdata="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" strokecolor="black [3200]" strokeweight=".5pt">
+              <v:line w14:anchorId="0F4AE41E" id="Straight Connector 2" o:spid="_x0000_s1026" style="position:absolute;z-index:251656192;visibility:visible;mso-wrap-style:square;mso-width-percent:0;mso-height-percent:0;mso-wrap-distance-left:9pt;mso-wrap-distance-top:0;mso-wrap-distance-right:9pt;mso-wrap-distance-bottom:0;mso-position-horizontal:absolute;mso-position-horizontal-relative:text;mso-position-vertical:absolute;mso-position-vertical-relative:text;mso-width-percent:0;mso-height-percent:0;mso-width-relative:margin;mso-height-relative:margin" from="-46.9pt,-10.9pt" to="93.75pt,-10.9pt" o:gfxdata="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" strokecolor="black [3200]" strokeweight=".5pt">
                 <v:stroke joinstyle="miter"/>
               </v:line>
             </w:pict>

</xml_diff>

<commit_message>
Add all (PK) and (FK)
</commit_message>
<xml_diff>
--- a/Documents/RaceDay_ERD.docx
+++ b/Documents/RaceDay_ERD.docx
@@ -470,6 +470,9 @@
                               </w:r>
                             </w:p>
                             <w:p>
+                              <w:pPr>
+                                <w:spacing w:after="0"/>
+                              </w:pPr>
                               <w:r>
                                 <w:t>ParticipantID (</w:t>
                               </w:r>
@@ -481,6 +484,9 @@
                               </w:r>
                             </w:p>
                             <w:p>
+                              <w:pPr>
+                                <w:spacing w:after="0"/>
+                              </w:pPr>
                               <w:r>
                                 <w:t>EventID (FK)</w:t>
                               </w:r>
@@ -543,6 +549,9 @@
                         </w:r>
                       </w:p>
                       <w:p>
+                        <w:pPr>
+                          <w:spacing w:after="0"/>
+                        </w:pPr>
                         <w:r>
                           <w:t>ParticipantID (</w:t>
                         </w:r>
@@ -554,6 +563,9 @@
                         </w:r>
                       </w:p>
                       <w:p>
+                        <w:pPr>
+                          <w:spacing w:after="0"/>
+                        </w:pPr>
                         <w:r>
                           <w:t>EventID (FK)</w:t>
                         </w:r>
@@ -765,11 +777,17 @@
                               </w:r>
                             </w:p>
                             <w:p>
+                              <w:pPr>
+                                <w:spacing w:after="0"/>
+                              </w:pPr>
                               <w:r>
                                 <w:t>ParticipantID (FK)</w:t>
                               </w:r>
                             </w:p>
                             <w:p>
+                              <w:pPr>
+                                <w:spacing w:after="0"/>
+                              </w:pPr>
                               <w:r>
                                 <w:t>EventID (FK)</w:t>
                               </w:r>
@@ -858,11 +876,17 @@
                         </w:r>
                       </w:p>
                       <w:p>
+                        <w:pPr>
+                          <w:spacing w:after="0"/>
+                        </w:pPr>
                         <w:r>
                           <w:t>ParticipantID (FK)</w:t>
                         </w:r>
                       </w:p>
                       <w:p>
+                        <w:pPr>
+                          <w:spacing w:after="0"/>
+                        </w:pPr>
                         <w:r>
                           <w:t>EventID (FK)</w:t>
                         </w:r>
@@ -897,7 +921,7 @@
         <mc:AlternateContent>
           <mc:Choice Requires="wps">
             <w:drawing>
-              <wp:anchor distT="0" distB="0" distL="114300" distR="114300" simplePos="0" relativeHeight="251676672" behindDoc="0" locked="0" layoutInCell="1" allowOverlap="1" wp14:anchorId="01A719A1" wp14:editId="0A9B9E68">
+              <wp:anchor distT="0" distB="0" distL="114300" distR="114300" simplePos="0" relativeHeight="251676672" behindDoc="0" locked="0" layoutInCell="1" allowOverlap="1" wp14:anchorId="01A719A1" wp14:editId="5E7274E3">
                 <wp:simplePos x="0" y="0"/>
                 <wp:positionH relativeFrom="column">
                   <wp:posOffset>7051985</wp:posOffset>
@@ -1103,7 +1127,7 @@
         <mc:AlternateContent>
           <mc:Choice Requires="wps">
             <w:drawing>
-              <wp:anchor distT="0" distB="0" distL="114300" distR="114300" simplePos="0" relativeHeight="251674624" behindDoc="0" locked="0" layoutInCell="1" allowOverlap="1" wp14:anchorId="57E44D0C" wp14:editId="0F18BE19">
+              <wp:anchor distT="0" distB="0" distL="114300" distR="114300" simplePos="0" relativeHeight="251674624" behindDoc="0" locked="0" layoutInCell="1" allowOverlap="1" wp14:anchorId="57E44D0C" wp14:editId="67FB1722">
                 <wp:simplePos x="0" y="0"/>
                 <wp:positionH relativeFrom="column">
                   <wp:posOffset>7095106</wp:posOffset>
@@ -1289,7 +1313,7 @@
           </mc:Choice>
           <mc:Fallback>
             <w:pict>
-              <v:group w14:anchorId="1D1EE431" id="Group 6" o:spid="_x0000_s1026" style="position:absolute;margin-left:551.15pt;margin-top:-45.7pt;width:140.6pt;height:190pt;z-index:251672576" coordsize="17856,24129" o:gfxdata="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">
+              <v:group w14:anchorId="19145B5D" id="Group 6" o:spid="_x0000_s1026" style="position:absolute;margin-left:551.15pt;margin-top:-45.7pt;width:140.6pt;height:190pt;z-index:251672576" coordsize="17856,24129" o:gfxdata="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">
                 <v:rect id="Rectangle 1" o:spid="_x0000_s1027" style="position:absolute;width:17856;height:24129;visibility:visible;mso-wrap-style:square;v-text-anchor:middle" o:gfxdata="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" filled="f" strokecolor="black [3213]" strokeweight="1pt"/>
                 <v:line id="Straight Connector 5" o:spid="_x0000_s1028" style="position:absolute;visibility:visible;mso-wrap-style:square" from="0,3934" to="17856,3934" o:connectortype="straight" o:gfxdata="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" strokecolor="black [3200]" strokeweight=".5pt">
                   <v:stroke joinstyle="miter"/>
@@ -1339,31 +1363,49 @@
                       <wps:txbx>
                         <w:txbxContent>
                           <w:p>
+                            <w:pPr>
+                              <w:spacing w:after="0"/>
+                            </w:pPr>
                             <w:r>
                               <w:t>ParticipantID (PK)</w:t>
                             </w:r>
                           </w:p>
                           <w:p>
+                            <w:pPr>
+                              <w:spacing w:after="0"/>
+                            </w:pPr>
                             <w:r>
                               <w:t>Name</w:t>
                             </w:r>
                           </w:p>
                           <w:p>
+                            <w:pPr>
+                              <w:spacing w:after="0"/>
+                            </w:pPr>
                             <w:r>
                               <w:t>Surname</w:t>
                             </w:r>
                           </w:p>
                           <w:p>
+                            <w:pPr>
+                              <w:spacing w:after="0"/>
+                            </w:pPr>
                             <w:r>
                               <w:t>Age</w:t>
                             </w:r>
                           </w:p>
                           <w:p>
+                            <w:pPr>
+                              <w:spacing w:after="0"/>
+                            </w:pPr>
                             <w:r>
                               <w:t>Email</w:t>
                             </w:r>
                           </w:p>
                           <w:p>
+                            <w:pPr>
+                              <w:spacing w:after="0"/>
+                            </w:pPr>
                             <w:r>
                               <w:t>PhoneNumber</w:t>
                             </w:r>
@@ -1391,31 +1433,49 @@
                 <v:textbox>
                   <w:txbxContent>
                     <w:p>
+                      <w:pPr>
+                        <w:spacing w:after="0"/>
+                      </w:pPr>
                       <w:r>
                         <w:t>ParticipantID (PK)</w:t>
                       </w:r>
                     </w:p>
                     <w:p>
+                      <w:pPr>
+                        <w:spacing w:after="0"/>
+                      </w:pPr>
                       <w:r>
                         <w:t>Name</w:t>
                       </w:r>
                     </w:p>
                     <w:p>
+                      <w:pPr>
+                        <w:spacing w:after="0"/>
+                      </w:pPr>
                       <w:r>
                         <w:t>Surname</w:t>
                       </w:r>
                     </w:p>
                     <w:p>
+                      <w:pPr>
+                        <w:spacing w:after="0"/>
+                      </w:pPr>
                       <w:r>
                         <w:t>Age</w:t>
                       </w:r>
                     </w:p>
                     <w:p>
+                      <w:pPr>
+                        <w:spacing w:after="0"/>
+                      </w:pPr>
                       <w:r>
                         <w:t>Email</w:t>
                       </w:r>
                     </w:p>
                     <w:p>
+                      <w:pPr>
+                        <w:spacing w:after="0"/>
+                      </w:pPr>
                       <w:r>
                         <w:t>PhoneNumber</w:t>
                       </w:r>
@@ -1620,7 +1680,7 @@
           </mc:Choice>
           <mc:Fallback>
             <w:pict>
-              <v:group w14:anchorId="1B9BEC3E" id="Group 6" o:spid="_x0000_s1026" style="position:absolute;margin-left:377.8pt;margin-top:-45.7pt;width:140.6pt;height:190pt;z-index:251666432" coordsize="17856,24129" o:gfxdata="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">
+              <v:group w14:anchorId="4D0CE533" id="Group 6" o:spid="_x0000_s1026" style="position:absolute;margin-left:377.8pt;margin-top:-45.7pt;width:140.6pt;height:190pt;z-index:251666432" coordsize="17856,24129" o:gfxdata="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">
                 <v:rect id="Rectangle 1" o:spid="_x0000_s1027" style="position:absolute;width:17856;height:24129;visibility:visible;mso-wrap-style:square;v-text-anchor:middle" o:gfxdata="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" filled="f" strokecolor="black [3213]" strokeweight="1pt"/>
                 <v:line id="Straight Connector 5" o:spid="_x0000_s1028" style="position:absolute;visibility:visible;mso-wrap-style:square" from="0,3934" to="17856,3934" o:connectortype="straight" o:gfxdata="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" strokecolor="black [3200]" strokeweight=".5pt">
                   <v:stroke joinstyle="miter"/>
@@ -1754,6 +1814,9 @@
                       <wps:txbx>
                         <w:txbxContent>
                           <w:p>
+                            <w:pPr>
+                              <w:spacing w:after="0"/>
+                            </w:pPr>
                             <w:r>
                               <w:t>OrganiserID (</w:t>
                             </w:r>
@@ -1765,21 +1828,33 @@
                             </w:r>
                           </w:p>
                           <w:p>
+                            <w:pPr>
+                              <w:spacing w:after="0"/>
+                            </w:pPr>
                             <w:r>
                               <w:t>Name</w:t>
                             </w:r>
                           </w:p>
                           <w:p>
+                            <w:pPr>
+                              <w:spacing w:after="0"/>
+                            </w:pPr>
                             <w:r>
                               <w:t>Surname</w:t>
                             </w:r>
                           </w:p>
                           <w:p>
+                            <w:pPr>
+                              <w:spacing w:after="0"/>
+                            </w:pPr>
                             <w:r>
                               <w:t>Email</w:t>
                             </w:r>
                           </w:p>
                           <w:p>
+                            <w:pPr>
+                              <w:spacing w:after="0"/>
+                            </w:pPr>
                             <w:r>
                               <w:t>PhoneNumber</w:t>
                             </w:r>
@@ -1807,6 +1882,9 @@
                 <v:textbox>
                   <w:txbxContent>
                     <w:p>
+                      <w:pPr>
+                        <w:spacing w:after="0"/>
+                      </w:pPr>
                       <w:r>
                         <w:t>OrganiserID (</w:t>
                       </w:r>
@@ -1818,21 +1896,33 @@
                       </w:r>
                     </w:p>
                     <w:p>
+                      <w:pPr>
+                        <w:spacing w:after="0"/>
+                      </w:pPr>
                       <w:r>
                         <w:t>Name</w:t>
                       </w:r>
                     </w:p>
                     <w:p>
+                      <w:pPr>
+                        <w:spacing w:after="0"/>
+                      </w:pPr>
                       <w:r>
                         <w:t>Surname</w:t>
                       </w:r>
                     </w:p>
                     <w:p>
+                      <w:pPr>
+                        <w:spacing w:after="0"/>
+                      </w:pPr>
                       <w:r>
                         <w:t>Email</w:t>
                       </w:r>
                     </w:p>
                     <w:p>
+                      <w:pPr>
+                        <w:spacing w:after="0"/>
+                      </w:pPr>
                       <w:r>
                         <w:t>PhoneNumber</w:t>
                       </w:r>
@@ -1953,7 +2043,7 @@
           </mc:Choice>
           <mc:Fallback>
             <w:pict>
-              <v:group w14:anchorId="16BBCD7B" id="Group 6" o:spid="_x0000_s1026" style="position:absolute;margin-left:170.8pt;margin-top:-46.05pt;width:140.6pt;height:190pt;z-index:251662336" coordsize="17856,24129" o:gfxdata="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">
+              <v:group w14:anchorId="192B61F9" id="Group 6" o:spid="_x0000_s1026" style="position:absolute;margin-left:170.8pt;margin-top:-46.05pt;width:140.6pt;height:190pt;z-index:251662336" coordsize="17856,24129" o:gfxdata="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">
                 <v:rect id="Rectangle 1" o:spid="_x0000_s1027" style="position:absolute;width:17856;height:24129;visibility:visible;mso-wrap-style:square;v-text-anchor:middle" o:gfxdata="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" filled="f" strokecolor="black [3213]" strokeweight="1pt"/>
                 <v:line id="Straight Connector 5" o:spid="_x0000_s1028" style="position:absolute;visibility:visible;mso-wrap-style:square" from="0,3934" to="17856,3934" o:connectortype="straight" o:gfxdata="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" strokecolor="black [3200]" strokeweight=".5pt">
                   <v:stroke joinstyle="miter"/>
@@ -2038,7 +2128,7 @@
           </mc:Choice>
           <mc:Fallback>
             <w:pict>
-              <v:rect w14:anchorId="2EF9E7A7" id="Rectangle 1" o:spid="_x0000_s1026" style="position:absolute;margin-left:-46.9pt;margin-top:-46.05pt;width:140.6pt;height:190pt;z-index:251655168;visibility:visible;mso-wrap-style:square;mso-width-percent:0;mso-height-percent:0;mso-wrap-distance-left:9pt;mso-wrap-distance-top:0;mso-wrap-distance-right:9pt;mso-wrap-distance-bottom:0;mso-position-horizontal:absolute;mso-position-horizontal-relative:text;mso-position-vertical:absolute;mso-position-vertical-relative:text;mso-width-percent:0;mso-height-percent:0;mso-width-relative:margin;mso-height-relative:margin;v-text-anchor:middle" o:gfxdata="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" filled="f" strokecolor="black [3213]" strokeweight="1pt"/>
+              <v:rect w14:anchorId="6FBFD139" id="Rectangle 1" o:spid="_x0000_s1026" style="position:absolute;margin-left:-46.9pt;margin-top:-46.05pt;width:140.6pt;height:190pt;z-index:251655168;visibility:visible;mso-wrap-style:square;mso-width-percent:0;mso-height-percent:0;mso-wrap-distance-left:9pt;mso-wrap-distance-top:0;mso-wrap-distance-right:9pt;mso-wrap-distance-bottom:0;mso-position-horizontal:absolute;mso-position-horizontal-relative:text;mso-position-vertical:absolute;mso-position-vertical-relative:text;mso-width-percent:0;mso-height-percent:0;mso-width-relative:margin;mso-height-relative:margin;v-text-anchor:middle" o:gfxdata="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" filled="f" strokecolor="black [3213]" strokeweight="1pt"/>
             </w:pict>
           </mc:Fallback>
         </mc:AlternateContent>
@@ -2083,31 +2173,49 @@
                       <wps:txbx>
                         <w:txbxContent>
                           <w:p>
+                            <w:pPr>
+                              <w:spacing w:after="0"/>
+                            </w:pPr>
                             <w:r>
                               <w:t>UserID (PK)</w:t>
                             </w:r>
                           </w:p>
                           <w:p>
+                            <w:pPr>
+                              <w:spacing w:after="0"/>
+                            </w:pPr>
                             <w:r>
                               <w:t>Email</w:t>
                             </w:r>
                           </w:p>
                           <w:p>
+                            <w:pPr>
+                              <w:spacing w:after="0"/>
+                            </w:pPr>
                             <w:r>
                               <w:t>PasswordHash</w:t>
                             </w:r>
                           </w:p>
                           <w:p>
+                            <w:pPr>
+                              <w:spacing w:after="0"/>
+                            </w:pPr>
                             <w:r>
                               <w:t>UserType</w:t>
                             </w:r>
                           </w:p>
                           <w:p>
+                            <w:pPr>
+                              <w:spacing w:after="0"/>
+                            </w:pPr>
                             <w:r>
                               <w:t>OrganiserID (FK)</w:t>
                             </w:r>
                           </w:p>
                           <w:p>
+                            <w:pPr>
+                              <w:spacing w:after="0"/>
+                            </w:pPr>
                             <w:r>
                               <w:t>ParticipantID (FK)</w:t>
                             </w:r>
@@ -2139,31 +2247,49 @@
                 <v:textbox>
                   <w:txbxContent>
                     <w:p>
+                      <w:pPr>
+                        <w:spacing w:after="0"/>
+                      </w:pPr>
                       <w:r>
                         <w:t>UserID (PK)</w:t>
                       </w:r>
                     </w:p>
                     <w:p>
+                      <w:pPr>
+                        <w:spacing w:after="0"/>
+                      </w:pPr>
                       <w:r>
                         <w:t>Email</w:t>
                       </w:r>
                     </w:p>
                     <w:p>
+                      <w:pPr>
+                        <w:spacing w:after="0"/>
+                      </w:pPr>
                       <w:r>
                         <w:t>PasswordHash</w:t>
                       </w:r>
                     </w:p>
                     <w:p>
+                      <w:pPr>
+                        <w:spacing w:after="0"/>
+                      </w:pPr>
                       <w:r>
                         <w:t>UserType</w:t>
                       </w:r>
                     </w:p>
                     <w:p>
+                      <w:pPr>
+                        <w:spacing w:after="0"/>
+                      </w:pPr>
                       <w:r>
                         <w:t>OrganiserID (FK)</w:t>
                       </w:r>
                     </w:p>
                     <w:p>
+                      <w:pPr>
+                        <w:spacing w:after="0"/>
+                      </w:pPr>
                       <w:r>
                         <w:t>ParticipantID (FK)</w:t>
                       </w:r>
@@ -2322,7 +2448,7 @@
           </mc:Choice>
           <mc:Fallback>
             <w:pict>
-              <v:line w14:anchorId="0F4AE41E" id="Straight Connector 2" o:spid="_x0000_s1026" style="position:absolute;z-index:251656192;visibility:visible;mso-wrap-style:square;mso-width-percent:0;mso-height-percent:0;mso-wrap-distance-left:9pt;mso-wrap-distance-top:0;mso-wrap-distance-right:9pt;mso-wrap-distance-bottom:0;mso-position-horizontal:absolute;mso-position-horizontal-relative:text;mso-position-vertical:absolute;mso-position-vertical-relative:text;mso-width-percent:0;mso-height-percent:0;mso-width-relative:margin;mso-height-relative:margin" from="-46.9pt,-10.9pt" to="93.75pt,-10.9pt" o:gfxdata="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" strokecolor="black [3200]" strokeweight=".5pt">
+              <v:line w14:anchorId="22674490" id="Straight Connector 2" o:spid="_x0000_s1026" style="position:absolute;z-index:251656192;visibility:visible;mso-wrap-style:square;mso-width-percent:0;mso-height-percent:0;mso-wrap-distance-left:9pt;mso-wrap-distance-top:0;mso-wrap-distance-right:9pt;mso-wrap-distance-bottom:0;mso-position-horizontal:absolute;mso-position-horizontal-relative:text;mso-position-vertical:absolute;mso-position-vertical-relative:text;mso-width-percent:0;mso-height-percent:0;mso-width-relative:margin;mso-height-relative:margin" from="-46.9pt,-10.9pt" to="93.75pt,-10.9pt" o:gfxdata="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" strokecolor="black [3200]" strokeweight=".5pt">
                 <v:stroke joinstyle="miter"/>
               </v:line>
             </w:pict>

</xml_diff>